<commit_message>
updated the work diary
</commit_message>
<xml_diff>
--- a/Munkanapló.docx
+++ b/Munkanapló.docx
@@ -479,7 +479,7 @@
                 <w:webHidden/>
                 <w:szCs w:val="24"/>
               </w:rPr>
-              <w:t>5</w:t>
+              <w:t>3</w:t>
             </w:r>
             <w:r>
               <w:rPr>
@@ -1052,8 +1052,13 @@
       </w:r>
     </w:p>
     <w:p>
-      <w:r>
-        <w:t xml:space="preserve">Ebben az időszakba </w:t>
+      <w:proofErr w:type="gramStart"/>
+      <w:r>
+        <w:t>Ebben</w:t>
+      </w:r>
+      <w:proofErr w:type="gramEnd"/>
+      <w:r>
+        <w:t xml:space="preserve"> az időszakba </w:t>
       </w:r>
       <w:r>
         <w:t xml:space="preserve">átnéztük </w:t>
@@ -1083,7 +1088,23 @@
     </w:p>
     <w:p>
       <w:r>
-        <w:t>Kritikus felismerés volt a SELECT * használatának kerülése a célzott oszlopkiválasztással szemben, valamint a sorok megszámlálásának finomhangolása: a COUNT(*) minden sort (a hiányzó adatokat is) regisztrálja, míg a COUNT(oszlop) specifikusan ignorálja a NULL értékeket. Alaposan feltérképeztem az ORDER BY záradék korlátait: nagy, indexelést nélkülöző adathalmazoknál a rendezés drasztikus memóriahasználattal (spill to disk) járhat, nem determinisztikus paraméterek esetén pedig a lapozás (OFFSET/FETCH) inkonzisztens eredményeket szülhet. Azt is megtanultam, hogy a legacy LOB típusok (pl. text, image) közvetlenül nem rendezhetők, csak megfelelő típuskonverzió után.</w:t>
+        <w:t xml:space="preserve">Kritikus felismerés volt a SELECT * használatának kerülése a célzott oszlopkiválasztással szemben, valamint a sorok megszámlálásának finomhangolása: a </w:t>
+      </w:r>
+      <w:proofErr w:type="gramStart"/>
+      <w:r>
+        <w:t>COUNT(</w:t>
+      </w:r>
+      <w:proofErr w:type="gramEnd"/>
+      <w:r>
+        <w:t xml:space="preserve">*) minden sort (a hiányzó adatokat is) regisztrálja, míg a </w:t>
+      </w:r>
+      <w:proofErr w:type="gramStart"/>
+      <w:r>
+        <w:t>COUNT(</w:t>
+      </w:r>
+      <w:proofErr w:type="gramEnd"/>
+      <w:r>
+        <w:t>oszlop) specifikusan ignorálja a NULL értékeket. Alaposan feltérképeztem az ORDER BY záradék korlátait: nagy, indexelést nélkülöző adathalmazoknál a rendezés drasztikus memóriahasználattal (spill to disk) járhat, nem determinisztikus paraméterek esetén pedig a lapozás (OFFSET/FETCH) inkonzisztens eredményeket szülhet. Azt is megtanultam, hogy a legacy LOB típusok (pl. text, image) közvetlenül nem rendezhetők, csak megfelelő típuskonverzió után.</w:t>
       </w:r>
     </w:p>
     <w:p>
@@ -1118,7 +1139,15 @@
       </w:r>
       <w:r>
         <w:lastRenderedPageBreak/>
-        <w:t>TABLE) fontosságát. Gyakorlatot szereztem a táblák klónozásában, megértve a SELECT INTO (struktúra és adat együttes létrehozása) és az INSERT INTO ... SELECT (adatok betöltése egy már létező sémába) utasítások közötti strukturális különbséget. Egy tranzakción belül a frissen generált azonosítók (Identity) kinyerésére a SCOPE_IDENTITY() függvényt és az OUTPUT záradékot használtam. Ezzel párhuzamosan megismerkedtem az adatbázis fizikai méretének menedzselésével: teszteltem a DBCC SHRINKDATABASE adatfájl-tömörítő eljárást, és használtam az sp_spaceused eljárást a táblák valós tárhelyigényének pontos felmérésére.</w:t>
+        <w:t>TABLE) fontosságát. Gyakorlatot szereztem a táblák klónozásában, megértve a SELECT INTO (struktúra és adat együttes létrehozása) és az INSERT INTO ... SELECT (adatok betöltése egy már létező sémába) utasítások közötti strukturális különbséget. Egy tranzakción belül a frissen generált azonosítók (Identity) kinyerésére a SCOPE_</w:t>
+      </w:r>
+      <w:proofErr w:type="gramStart"/>
+      <w:r>
+        <w:t>IDENTITY(</w:t>
+      </w:r>
+      <w:proofErr w:type="gramEnd"/>
+      <w:r>
+        <w:t>) függvényt és az OUTPUT záradékot használtam. Ezzel párhuzamosan megismerkedtem az adatbázis fizikai méretének menedzselésével: teszteltem a DBCC SHRINKDATABASE adatfájl-tömörítő eljárást, és használtam az sp_spaceused eljárást a táblák valós tárhelyigényének pontos felmérésére.</w:t>
       </w:r>
     </w:p>
     <w:p>
@@ -1460,7 +1489,15 @@
     </w:p>
     <w:p>
       <w:r>
-        <w:t>Végül a CSS alapjaival foglalkoztam. Megtanultam az alap HTML tagek et és hogy ezekre hogy kell hivatkozni CSS-ben.</w:t>
+        <w:t xml:space="preserve">Végül a CSS alapjaival foglalkoztam. Megtanultam az alap HTML tagek et és hogy </w:t>
+      </w:r>
+      <w:proofErr w:type="gramStart"/>
+      <w:r>
+        <w:t>ezekre</w:t>
+      </w:r>
+      <w:proofErr w:type="gramEnd"/>
+      <w:r>
+        <w:t xml:space="preserve"> hogy kell hivatkozni CSS-ben.</w:t>
       </w:r>
     </w:p>
     <w:p>
@@ -1531,6 +1568,191 @@
     </w:p>
     <w:p>
       <w:pPr>
+        <w:pStyle w:val="Cmsor2"/>
+      </w:pPr>
+      <w:r>
+        <w:t>CSS alapok: Kaszkádolás, specifitás és a Box Model</w:t>
+      </w:r>
+    </w:p>
+    <w:p>
+      <w:r>
+        <w:t xml:space="preserve">A backend és adatbázis technológiák mellett elmélyedtem a modern frontend fejlesztés alapjaiban, különös tekintettel a weboldalak vizuális megjelenéséért felelős Cascading Style Sheets (CSS) nyelvre. Megismertem a CSS kaszkádolási logikáját (Cascading) és a szelektorok specifitásának (Specificity) hierarchiáját, amely meghatározza, hogy ütközés esetén melyik stílusdeklaráció érvényesül. Alkalmaztam osztály- (class) és azonosító- (id) szelektorokat, valamint elsajátítottam a pszeudo-osztályok </w:t>
+      </w:r>
+      <w:proofErr w:type="gramStart"/>
+      <w:r>
+        <w:t>(:hover, :nth</w:t>
+      </w:r>
+      <w:proofErr w:type="gramEnd"/>
+      <w:r>
+        <w:t>-child</w:t>
+      </w:r>
+      <w:proofErr w:type="gramStart"/>
+      <w:r>
+        <w:t>, :focus</w:t>
+      </w:r>
+      <w:proofErr w:type="gramEnd"/>
+      <w:r>
+        <w:t xml:space="preserve">) és pszeudo-elemek </w:t>
+      </w:r>
+      <w:proofErr w:type="gramStart"/>
+      <w:r>
+        <w:t>(::</w:t>
+      </w:r>
+      <w:proofErr w:type="gramEnd"/>
+      <w:r>
+        <w:t>before</w:t>
+      </w:r>
+      <w:proofErr w:type="gramStart"/>
+      <w:r>
+        <w:t>, ::after</w:t>
+      </w:r>
+      <w:proofErr w:type="gramEnd"/>
+      <w:r>
+        <w:t>) használatát a dinamikus és interaktív UI elemek létrehozásához.</w:t>
+      </w:r>
+    </w:p>
+    <w:p>
+      <w:r>
+        <w:t>A webes elrendezések megértésének és a méretezési anomáliák elkerülésének kulcsa a CSS Box Model alapos megismerése volt.</w:t>
+      </w:r>
+    </w:p>
+    <w:p>
+      <w:r>
+        <w:t>Tisztáztam a tartalom (content), a belső margó (padding), a szegély (border) és a külső margó (margin) egymáshoz való viszonyát. Gyakorlati szempontból elengedhetetlen volt a box-sizing: border-box tulajdonság globális alkalmazása, amely biztosítja, hogy a padding és a border a megadott szélességen belül maradjon, megkönnyítve a reszponzív elemek tervezését.</w:t>
+      </w:r>
+    </w:p>
+    <w:p>
+      <w:pPr>
+        <w:pStyle w:val="Cmsor2"/>
+      </w:pPr>
+      <w:r>
+        <w:t>Modern layout rendszerek és reszponzivitás</w:t>
+      </w:r>
+    </w:p>
+    <w:p>
+      <w:r>
+        <w:t>Az oldalstruktúrák felépítéséhez elhagytam az elavult (például float-alapú) megoldásokat, és a modern</w:t>
+      </w:r>
+      <w:r>
+        <w:t xml:space="preserve"> </w:t>
+      </w:r>
+      <w:r>
+        <w:t>layout rendszerekre fókuszáltam. Az egydimenziós elrendezésekhez (sorok vagy oszlopok dinamikus térkitöltéséhez és igazításához) a Flexbox technológiát alkalmaztam. A komplexebb, kétdimenziós hálózatok (több sorból és oszlopból álló, aszimmetrikus rácsok) kialakítására pedig a CSS Grid-et használtam.</w:t>
+      </w:r>
+    </w:p>
+    <w:p>
+      <w:r>
+        <w:t>A különböző kijelzőméretekhez (mobil, tablet, asztali gép) való alkalmazkodást a reszponzív webdesign elvei alapján, a médialekérdezések (@media queries) segítségével oldottam meg. A fix pixelek (px) helyett áttértem a relatív mértékegységek (rem, em, vh, vw, %) használatára, amely garantálja a komponensek akadálymentes és a böngésző beállításaihoz alkalmazkodó (méretezhető) megjelenését.</w:t>
+      </w:r>
+    </w:p>
+    <w:p>
+      <w:pPr>
+        <w:pStyle w:val="Cmsor2"/>
+      </w:pPr>
+      <w:r>
+        <w:t>Tailwind CSS: Paradigmaváltás a Utility-First megközelítéssel</w:t>
+      </w:r>
+    </w:p>
+    <w:p>
+      <w:r>
+        <w:t>A nyers CSS korlátainak és karbantartási nehézségeinek (hatalmas stílusfájlok, globális névütközések) feloldására megismerkedtem a Tailwind CSS keretrendszerrel.</w:t>
+      </w:r>
+    </w:p>
+    <w:p>
+      <w:r>
+        <w:t>A Tailwind egy úgynevezett "utility-first" keretrendszer: a hagyományos</w:t>
+      </w:r>
+      <w:r>
+        <w:t xml:space="preserve"> </w:t>
+      </w:r>
+      <w:r>
+        <w:t>osztálynevek helyett alacsony szintű, egy-egy konkrét CSS tulajdonságot lefedő osztályokat (pl. flex, pt-4, text-center, rounded-lg) biztosít. Ennek köszönhetően a kontextusváltás nélkül, közvetlenül a HTML struktúrában tudtam a dizájnt kialakítani, ami drasztikusan felgyorsította a fejlesztési folyamatot.</w:t>
+      </w:r>
+    </w:p>
+    <w:p>
+      <w:pPr>
+        <w:pStyle w:val="Cmsor2"/>
+      </w:pPr>
+      <w:r>
+        <w:lastRenderedPageBreak/>
+        <w:t>Reszponzív módosítók és interakció-kezelés</w:t>
+      </w:r>
+    </w:p>
+    <w:p>
+      <w:r>
+        <w:t>A Tailwind reszponzív logikája kiválóan és intuitívan illeszkedik a Mobile-First elvhez. Az osztályok elé illesztett prefixekkel (</w:t>
+      </w:r>
+      <w:proofErr w:type="gramStart"/>
+      <w:r>
+        <w:t>sm:,</w:t>
+      </w:r>
+      <w:proofErr w:type="gramEnd"/>
+      <w:r>
+        <w:t xml:space="preserve"> </w:t>
+      </w:r>
+      <w:proofErr w:type="gramStart"/>
+      <w:r>
+        <w:t>md:,</w:t>
+      </w:r>
+      <w:proofErr w:type="gramEnd"/>
+      <w:r>
+        <w:t xml:space="preserve"> lg:) könnyedén alkalmaztam képernyőspecifikus stílusokat anélkül, hogy egyetlen sor @media query-t kellett volna írnom (például egy elem mobilokon egyoszlopos, asztali gépen háromoszlopos: grid-cols-1 </w:t>
+      </w:r>
+      <w:proofErr w:type="gramStart"/>
+      <w:r>
+        <w:t>md:grid</w:t>
+      </w:r>
+      <w:proofErr w:type="gramEnd"/>
+      <w:r>
+        <w:t xml:space="preserve">-cols-3). Hasonló prefix logikával kezeltem a felhasználói interakciókat is, dinamikusan változtatva a megjelenést a </w:t>
+      </w:r>
+      <w:proofErr w:type="gramStart"/>
+      <w:r>
+        <w:t>hover:,</w:t>
+      </w:r>
+      <w:proofErr w:type="gramEnd"/>
+      <w:r>
+        <w:t xml:space="preserve"> </w:t>
+      </w:r>
+      <w:proofErr w:type="gramStart"/>
+      <w:r>
+        <w:t>focus:,</w:t>
+      </w:r>
+      <w:proofErr w:type="gramEnd"/>
+      <w:r>
+        <w:t xml:space="preserve"> vagy active: módosítókkal (pl. hover:bg-blue-600).</w:t>
+      </w:r>
+    </w:p>
+    <w:p>
+      <w:pPr>
+        <w:pStyle w:val="Cmsor2"/>
+      </w:pPr>
+      <w:r>
+        <w:t>Megoldandó feladatok</w:t>
+      </w:r>
+    </w:p>
+    <w:p>
+      <w:r>
+        <w:t>A projektvezetővel ötletelve kitaláltunk pár feladatot a Tailwind gyakorlására. E</w:t>
+      </w:r>
+      <w:r>
+        <w:t xml:space="preserve">gy </w:t>
+      </w:r>
+      <w:r>
+        <w:t xml:space="preserve">csempe elrendezésű </w:t>
+      </w:r>
+      <w:r>
+        <w:t xml:space="preserve">nézetet, naptárat napi heti és havi nézettel és egy hierarchikus nézetet kellett </w:t>
+      </w:r>
+      <w:r>
+        <w:t xml:space="preserve">a következő időszakban </w:t>
+      </w:r>
+      <w:r>
+        <w:t>csinálnom, emellett lemásoltam a telex oldalának az elrendezését.</w:t>
+      </w:r>
+    </w:p>
+    <w:p>
+      <w:pPr>
         <w:pStyle w:val="Cmsor1"/>
         <w:rPr>
           <w:rFonts w:cs="Times New Roman"/>
@@ -1593,6 +1815,206 @@
           <w:szCs w:val="24"/>
         </w:rPr>
         <w:t>. (40 munkaóra)</w:t>
+      </w:r>
+    </w:p>
+    <w:p>
+      <w:r>
+        <w:t>Folytattam az ismerkedést a Tailwinddel és elkezdtem megvalósítani a korábban a projektvezetővel megbeszélt feladatokat.</w:t>
+      </w:r>
+    </w:p>
+    <w:p>
+      <w:pPr>
+        <w:pStyle w:val="Cmsor2"/>
+      </w:pPr>
+      <w:r>
+        <w:t>Architektúra, testreszabhatóság és a JIT Compiler</w:t>
+      </w:r>
+    </w:p>
+    <w:p>
+      <w:r>
+        <w:t>Bár a Tailwind alapértelmezetten egy gazdag, előre definiált dizájnrendszerrel érkezik, megtanultam a tailwind.config.js fájlon keresztül a teljes arculat testreszabását. Itt definiáltam a projekt specifikus színpalettáit, egyedi betűtípusait és az egyedi töréspontokat (breakpoints). Megértettem a Tailwind modern Just-In-Time (JIT) fordítójának működését is: a rendszer a build folyamat során végigpásztázza a forráskódokat, és csak azokat a CSS osztályokat generálja le és fordítja bele a végső fájlba, amelyeket ténylegesen felhasználtam. Ez extrém kis méretű, optimális betöltési sebességet garantáló kimeneti CSS fájlt eredményez.</w:t>
+      </w:r>
+    </w:p>
+    <w:p>
+      <w:pPr>
+        <w:pStyle w:val="Cmsor2"/>
+      </w:pPr>
+      <w:r>
+        <w:t>Gyakorlati UI fejlesztés: Komplex komponensek és nézetek</w:t>
+      </w:r>
+    </w:p>
+    <w:p>
+      <w:r>
+        <w:t xml:space="preserve">A Tailwind CSS logikájának megértését követően konkrét, összetett frontend feladatokat kaptam, amelyek során a gyakorlatban is implementálhattam </w:t>
+      </w:r>
+      <w:proofErr w:type="gramStart"/>
+      <w:r>
+        <w:t>a</w:t>
+      </w:r>
+      <w:proofErr w:type="gramEnd"/>
+      <w:r>
+        <w:t xml:space="preserve"> utility-first megközelítést.</w:t>
+      </w:r>
+    </w:p>
+    <w:p>
+      <w:r>
+        <w:t xml:space="preserve">Először a </w:t>
+      </w:r>
+      <w:r>
+        <w:t>n</w:t>
+      </w:r>
+      <w:r>
+        <w:t>aptá</w:t>
+      </w:r>
+      <w:r>
+        <w:t>rat valósítottam meg</w:t>
+      </w:r>
+      <w:r>
+        <w:t>, amelynél napi, heti és havi nézetet is biztosítanom kellett. A havi nézet megvalósításakor a 7-oszlopos rácsrendszer fixálása (grid-cols-7) volt a kulcs, míg a napi és heti nézeteknél a Flexboxot és az abszolút pozicionálást (relative, absolute) használtam</w:t>
+      </w:r>
+      <w:r>
+        <w:t>.</w:t>
+      </w:r>
+    </w:p>
+    <w:p>
+      <w:r>
+        <w:t>Ezután</w:t>
+      </w:r>
+      <w:r>
+        <w:t xml:space="preserve"> egy reszponzív Tile (csempe) nézetet alakítottam ki. A CSS Grid rendszert és a Tailwind rács-specifikus (grid, grid-cols-, gap) osztályait kombinálva egy olyan dinamikus kártyás elrendezést hoztam létre, amely az adatok mennyiségétől és a böngészőablak szélességétől függően automatikusan újrarendeződik.</w:t>
+      </w:r>
+    </w:p>
+    <w:p>
+      <w:r>
+        <w:t>Emellett egy</w:t>
+      </w:r>
+      <w:r>
+        <w:t xml:space="preserve"> </w:t>
+      </w:r>
+      <w:r>
+        <w:t>Hierarchikus nézetet</w:t>
+      </w:r>
+      <w:r>
+        <w:t xml:space="preserve"> is készítettem a </w:t>
+      </w:r>
+      <w:r>
+        <w:t>beégetett</w:t>
+      </w:r>
+      <w:r>
+        <w:t xml:space="preserve"> adatok átlátható megjelenítésére. Itt a Tailwind margó- és padding osztályai</w:t>
+      </w:r>
+      <w:r>
+        <w:t>t</w:t>
+      </w:r>
+      <w:r>
+        <w:t xml:space="preserve"> (ml-4, pl-4), valamint a finom, bal oldali szegélyek</w:t>
+      </w:r>
+      <w:r>
+        <w:t>et</w:t>
+      </w:r>
+      <w:r>
+        <w:t xml:space="preserve"> (border-l)</w:t>
+      </w:r>
+      <w:r>
+        <w:t xml:space="preserve"> használtam a </w:t>
+      </w:r>
+      <w:r>
+        <w:t>vizuális tagolás</w:t>
+      </w:r>
+      <w:r>
+        <w:t>hoz.</w:t>
+      </w:r>
+    </w:p>
+    <w:p>
+      <w:pPr>
+        <w:pStyle w:val="Cmsor2"/>
+      </w:pPr>
+      <w:r>
+        <w:t>Valós layout rekonstrukció: A Telex hírportál klónozása</w:t>
+      </w:r>
+    </w:p>
+    <w:p>
+      <w:r>
+        <w:t xml:space="preserve">A frontend tudásom és a keretrendszer határainak teszteléseként </w:t>
+      </w:r>
+      <w:r>
+        <w:t xml:space="preserve">megpróbáltam </w:t>
+      </w:r>
+      <w:r>
+        <w:t xml:space="preserve">vizuálisan </w:t>
+      </w:r>
+      <w:r>
+        <w:t>le</w:t>
+      </w:r>
+      <w:r>
+        <w:t>másol</w:t>
+      </w:r>
+      <w:r>
+        <w:t xml:space="preserve">ni </w:t>
+      </w:r>
+      <w:r>
+        <w:t xml:space="preserve">a </w:t>
+      </w:r>
+      <w:r>
+        <w:rPr>
+          <w:b/>
+          <w:bCs/>
+        </w:rPr>
+        <w:t>Telex hírportál</w:t>
+      </w:r>
+      <w:r>
+        <w:t xml:space="preserve"> aszimmetrikus, információ-gazdag főoldali elrendezését. Ez a projekt tökéletesen rávilágított a Tailwind erejére: a rengeteg egyedi térköz, a különböző töréspontokon (</w:t>
+      </w:r>
+      <w:proofErr w:type="gramStart"/>
+      <w:r>
+        <w:t>md:,</w:t>
+      </w:r>
+      <w:proofErr w:type="gramEnd"/>
+      <w:r>
+        <w:t xml:space="preserve"> </w:t>
+      </w:r>
+      <w:proofErr w:type="gramStart"/>
+      <w:r>
+        <w:t>lg:,</w:t>
+      </w:r>
+      <w:proofErr w:type="gramEnd"/>
+      <w:r>
+        <w:t xml:space="preserve"> xl:) drasztikusan átrendeződő rácsszerkezet (például a kiemelt vezető hír és a mellette lévő kisebb hírfolyam arányainak változása), valamint a tipográfiai finomhangolások mind hatékonyan, egyetlen fájlon belül (a HTML szintjén) megoldhatók voltak. A modern CSS property-k (mint a flex-wrap vagy az aszimmetrikus grid-template-ek) </w:t>
+      </w:r>
+      <w:r>
+        <w:lastRenderedPageBreak/>
+        <w:t>Tailwindes megfelelőinek használatával sikeresen rekonstruáltam egy éles, nagy forgalmú weboldal megjelenését.</w:t>
+      </w:r>
+    </w:p>
+    <w:p>
+      <w:pPr>
+        <w:pStyle w:val="Cmsor2"/>
+      </w:pPr>
+      <w:r>
+        <w:t>Visszatérés a webes alkalmazás teszteléséhez</w:t>
+      </w:r>
+    </w:p>
+    <w:p>
+      <w:r>
+        <w:t xml:space="preserve">A frontend feladatok </w:t>
+      </w:r>
+      <w:r>
+        <w:t xml:space="preserve">mellett </w:t>
+      </w:r>
+      <w:r>
+        <w:t xml:space="preserve">visszatértem a gyakorlatom elején megkezdett minőségbiztosítási </w:t>
+      </w:r>
+      <w:r>
+        <w:t>feladathoz</w:t>
+      </w:r>
+      <w:r>
+        <w:t>, a cég webes alkalmazásának teszteléséhez. A</w:t>
+      </w:r>
+      <w:r>
+        <w:t>z előző tesztelésből tanulva a mostani</w:t>
+      </w:r>
+      <w:r>
+        <w:t xml:space="preserve"> Use Case teszteléseket már egy sokkal átfogóbb szemlélettel tudtam folytatni.</w:t>
       </w:r>
     </w:p>
     <w:p>

</xml_diff>